<commit_message>
Add manual procedure doc for dll library
</commit_message>
<xml_diff>
--- a/1.training_model/slide_presentation/Step - develope dll library in visual studio.docx
+++ b/1.training_model/slide_presentation/Step - develope dll library in visual studio.docx
@@ -590,13 +590,7 @@
               <w:t xml:space="preserve"> </w:t>
             </w:r>
             <w:r>
-              <w:t xml:space="preserve">Add </w:t>
-            </w:r>
-            <w:r>
-              <w:t>dependencies at</w:t>
-            </w:r>
-            <w:r>
-              <w:t xml:space="preserve"> Device Cluster</w:t>
+              <w:t>Add dependencies at Device Cluster</w:t>
             </w:r>
           </w:p>
         </w:tc>
@@ -652,6 +646,9 @@
     <w:p>
       <w:r>
         <w:t>Step of developing DLL library in Visual Studio using C#</w:t>
+      </w:r>
+      <w:r>
+        <w:t>.</w:t>
       </w:r>
     </w:p>
     <w:sectPr>
@@ -1388,6 +1385,7 @@
   <w:style w:type="character" w:default="1" w:styleId="DefaultParagraphFont">
     <w:name w:val="Default Paragraph Font"/>
     <w:uiPriority w:val="1"/>
+    <w:semiHidden/>
     <w:unhideWhenUsed/>
   </w:style>
   <w:style w:type="table" w:default="1" w:styleId="TableNormal">

</xml_diff>